<commit_message>
Add genetic-algorithm optimisation and SolidWorks stiffness analysis (Siemens Energy docs + rule)
Co-Authored-By: Claude Opus 5.5 <noreply@anthropic.com>
Claude-Session: https://claude.ai/code/session_01NjdMuB9buEkMmyf7HkyEWg
</commit_message>
<xml_diff>
--- a/applications/Siemens_Energy_Structural_Calculation_Engineer_Finspang/Arunabha_Majumder_Siemens_Energy_CV.docx
+++ b/applications/Siemens_Energy_Structural_Calculation_Engineer_Finspang/Arunabha_Majumder_Siemens_Energy_CV.docx
@@ -134,7 +134,7 @@
           <w:b w:val="0"/>
           <w:i w:val="0"/>
         </w:rPr>
-        <w:t>Mechanical engineer with a strong base in modelling, calculations and test validation. In my PhD I worked on stiffness modelling and Jacobian-based force estimation for a parallel robot, checked against force sensor measurements, and designed load-carrying parts for a shoulder exoskeleton. I use MATLAB daily for calculations and data processing, and I write clear technical reports and papers. PhD in Mechatronics and Robotics at Aalborg University (thesis expected March).</w:t>
+        <w:t>Mechanical engineer with a strong base in modelling, calculations and test validation. In my PhD I worked on stiffness modelling and Jacobian-based force estimation for a parallel robot, checked against force sensor measurements. I designed the load-carrying parts of a shoulder exoskeleton, checked them with stiffness analysis in SolidWorks and optimised the design with a genetic algorithm. I use MATLAB daily for calculations and data processing, and I write clear technical reports and papers. PhD in Mechatronics and Robotics at Aalborg University (thesis expected March).</w:t>
       </w:r>
     </w:p>
     <w:p>
@@ -166,6 +166,21 @@
       </w:r>
       <w:r>
         <w:t>Stiffness modelling, kinematics and Jacobian-based force estimation, validated against sensor data</w:t>
+      </w:r>
+    </w:p>
+    <w:p>
+      <w:pPr>
+        <w:pStyle w:val="ListBullet"/>
+        <w:spacing w:after="40"/>
+      </w:pPr>
+      <w:r>
+        <w:rPr>
+          <w:b/>
+        </w:rPr>
+        <w:t xml:space="preserve">Analysis and optimisation: </w:t>
+      </w:r>
+      <w:r>
+        <w:t>Stiffness analysis in SolidWorks; design optimisation with a genetic algorithm</w:t>
       </w:r>
     </w:p>
     <w:p>
@@ -286,6 +301,15 @@
       </w:pPr>
       <w:r>
         <w:t>Owned the mechanical design from hand sketches to SolidWorks models and drawings, then 3D printed and rebuilt parts many times to improve fit, strength and ease of assembly.</w:t>
+      </w:r>
+    </w:p>
+    <w:p>
+      <w:pPr>
+        <w:pStyle w:val="ListBullet"/>
+        <w:spacing w:after="40"/>
+      </w:pPr>
+      <w:r>
+        <w:t>Optimised the exoskeleton design with a genetic algorithm and checked part stiffness with stiffness analysis in SolidWorks.</w:t>
       </w:r>
     </w:p>
     <w:p>

</xml_diff>

<commit_message>
Exoskeleton stiffness measured on a physical test setup, not SolidWorks; fix docs and rules
Co-Authored-By: Claude Opus 5.5 <noreply@anthropic.com>
Claude-Session: https://claude.ai/code/session_01NjdMuB9buEkMmyf7HkyEWg
</commit_message>
<xml_diff>
--- a/applications/Siemens_Energy_Structural_Calculation_Engineer_Finspang/Arunabha_Majumder_Siemens_Energy_CV.docx
+++ b/applications/Siemens_Energy_Structural_Calculation_Engineer_Finspang/Arunabha_Majumder_Siemens_Energy_CV.docx
@@ -134,7 +134,7 @@
           <w:b w:val="0"/>
           <w:i w:val="0"/>
         </w:rPr>
-        <w:t>Mechanical engineer with a strong base in modelling, calculations and test validation. In my PhD I worked on stiffness modelling and Jacobian-based force estimation for a parallel robot, checked against force sensor measurements. I designed the load-carrying parts of a shoulder exoskeleton, checked them with stiffness analysis in SolidWorks and optimised the design with a genetic algorithm. I use MATLAB daily for calculations and data processing, and I write clear technical reports and papers. PhD in Mechatronics and Robotics at Aalborg University (thesis expected March).</w:t>
+        <w:t>Mechanical engineer with a strong base in modelling, calculations and test validation. In my PhD I worked on stiffness modelling and Jacobian-based force estimation for a parallel robot, checked against force sensor measurements. I designed the load-carrying parts of a shoulder exoskeleton, optimised the design with a genetic algorithm and measured its stiffness on a physical test setup. I use MATLAB daily for calculations and data processing, and I write clear technical reports and papers. PhD in Mechatronics and Robotics at Aalborg University (thesis expected March).</w:t>
       </w:r>
     </w:p>
     <w:p>
@@ -309,7 +309,7 @@
         <w:spacing w:after="40"/>
       </w:pPr>
       <w:r>
-        <w:t>Optimised the exoskeleton design with a genetic algorithm and checked part stiffness with stiffness analysis in SolidWorks.</w:t>
+        <w:t>Optimised the exoskeleton design with a genetic algorithm and measured the stiffness it provides on a physical test setup.</w:t>
       </w:r>
     </w:p>
     <w:p>

</xml_diff>